<commit_message>
docs: reconcile data counts and clarify PharmaScan methodology
</commit_message>
<xml_diff>
--- a/paper/Formatting_Instructions_For_NeurIPS_2026/MD6329_Cover_Page.docx
+++ b/paper/Formatting_Instructions_For_NeurIPS_2026/MD6329_Cover_Page.docx
@@ -185,6 +185,12 @@
                 <w:rFonts w:ascii="Calibri" w:hAnsi="Calibri" w:eastAsia="Calibri" w:cs="Calibri"/>
               </w:rPr>
               <w:t xml:space="preserve">DING ZIXIN (G2602715D),  PAN SHENGXIN (</w:t>
+            </w:r>
+            <w:r>
+              <w:rPr>
+                <w:rFonts w:ascii="Calibri" w:cs="Calibri"/>
+              </w:rPr>
+              <w:t>G2601614B)</w:t>
             </w:r>
           </w:p>
         </w:tc>

</xml_diff>